<commit_message>
feat: embed logos thumbnails and screenshots into all compliance docx files
Agent-Logs-Url: https://github.com/vinayak-rp-17801/Marketplace-4/sessions/9a8fbbd7-eb2f-4157-911b-dbd9832e40b2

Co-authored-by: vinayak-rp-17801 <274294319+vinayak-rp-17801@users.noreply.github.com>
</commit_message>
<xml_diff>
--- a/compliances-docx/acpr-it-and-outsourcing-instructions-compliance-for-log360-cloud.docx
+++ b/compliances-docx/acpr-it-and-outsourcing-instructions-compliance-for-log360-cloud.docx
@@ -72,6 +72,230 @@
       </w:pPr>
       <w:r>
         <w:t>Export ACPR-ready compliance evidence in PDF and CSV formats for supervisory examinations and internal financial IT governance reviews.</w:t>
+      </w:r>
+    </w:p>
+    <w:p>
+      <w:r>
+        <w:drawing>
+          <wp:inline xmlns:a="http://schemas.openxmlformats.org/drawingml/2006/main" xmlns:pic="http://schemas.openxmlformats.org/drawingml/2006/picture">
+            <wp:extent cx="1714500" cy="1714500"/>
+            <wp:docPr id="1" name="Picture 1"/>
+            <wp:cNvGraphicFramePr>
+              <a:graphicFrameLocks noChangeAspect="1"/>
+            </wp:cNvGraphicFramePr>
+            <a:graphic>
+              <a:graphicData uri="http://schemas.openxmlformats.org/drawingml/2006/picture">
+                <pic:pic>
+                  <pic:nvPicPr>
+                    <pic:cNvPr id="0" name="ACPR_180x180.png"/>
+                    <pic:cNvPicPr/>
+                  </pic:nvPicPr>
+                  <pic:blipFill>
+                    <a:blip r:embed="rId9"/>
+                    <a:stretch>
+                      <a:fillRect/>
+                    </a:stretch>
+                  </pic:blipFill>
+                  <pic:spPr>
+                    <a:xfrm>
+                      <a:off x="0" y="0"/>
+                      <a:ext cx="1714500" cy="1714500"/>
+                    </a:xfrm>
+                    <a:prstGeom prst="rect"/>
+                  </pic:spPr>
+                </pic:pic>
+              </a:graphicData>
+            </a:graphic>
+          </wp:inline>
+        </w:drawing>
+      </w:r>
+    </w:p>
+    <w:p>
+      <w:r>
+        <w:drawing>
+          <wp:inline xmlns:a="http://schemas.openxmlformats.org/drawingml/2006/main" xmlns:pic="http://schemas.openxmlformats.org/drawingml/2006/picture">
+            <wp:extent cx="7048500" cy="3238500"/>
+            <wp:docPr id="2" name="Picture 2"/>
+            <wp:cNvGraphicFramePr>
+              <a:graphicFrameLocks noChangeAspect="1"/>
+            </wp:cNvGraphicFramePr>
+            <a:graphic>
+              <a:graphicData uri="http://schemas.openxmlformats.org/drawingml/2006/picture">
+                <pic:pic>
+                  <pic:nvPicPr>
+                    <pic:cNvPr id="0" name="ACPR_740x340.png"/>
+                    <pic:cNvPicPr/>
+                  </pic:nvPicPr>
+                  <pic:blipFill>
+                    <a:blip r:embed="rId10"/>
+                    <a:stretch>
+                      <a:fillRect/>
+                    </a:stretch>
+                  </pic:blipFill>
+                  <pic:spPr>
+                    <a:xfrm>
+                      <a:off x="0" y="0"/>
+                      <a:ext cx="7048500" cy="3238500"/>
+                    </a:xfrm>
+                    <a:prstGeom prst="rect"/>
+                  </pic:spPr>
+                </pic:pic>
+              </a:graphicData>
+            </a:graphic>
+          </wp:inline>
+        </w:drawing>
+      </w:r>
+    </w:p>
+    <w:p>
+      <w:pPr>
+        <w:pStyle w:val="Heading2"/>
+      </w:pPr>
+      <w:r>
+        <w:t>Screenshots</w:t>
+      </w:r>
+    </w:p>
+    <w:p>
+      <w:r>
+        <w:drawing>
+          <wp:inline xmlns:a="http://schemas.openxmlformats.org/drawingml/2006/main" xmlns:pic="http://schemas.openxmlformats.org/drawingml/2006/picture">
+            <wp:extent cx="5943600" cy="3343275"/>
+            <wp:docPr id="3" name="Picture 3"/>
+            <wp:cNvGraphicFramePr>
+              <a:graphicFrameLocks noChangeAspect="1"/>
+            </wp:cNvGraphicFramePr>
+            <a:graphic>
+              <a:graphicData uri="http://schemas.openxmlformats.org/drawingml/2006/picture">
+                <pic:pic>
+                  <pic:nvPicPr>
+                    <pic:cNvPr id="0" name="01_overview.png"/>
+                    <pic:cNvPicPr/>
+                  </pic:nvPicPr>
+                  <pic:blipFill>
+                    <a:blip r:embed="rId11"/>
+                    <a:stretch>
+                      <a:fillRect/>
+                    </a:stretch>
+                  </pic:blipFill>
+                  <pic:spPr>
+                    <a:xfrm>
+                      <a:off x="0" y="0"/>
+                      <a:ext cx="5943600" cy="3343275"/>
+                    </a:xfrm>
+                    <a:prstGeom prst="rect"/>
+                  </pic:spPr>
+                </pic:pic>
+              </a:graphicData>
+            </a:graphic>
+          </wp:inline>
+        </w:drawing>
+      </w:r>
+    </w:p>
+    <w:p>
+      <w:r>
+        <w:drawing>
+          <wp:inline xmlns:a="http://schemas.openxmlformats.org/drawingml/2006/main" xmlns:pic="http://schemas.openxmlformats.org/drawingml/2006/picture">
+            <wp:extent cx="5943600" cy="3343275"/>
+            <wp:docPr id="4" name="Picture 4"/>
+            <wp:cNvGraphicFramePr>
+              <a:graphicFrameLocks noChangeAspect="1"/>
+            </wp:cNvGraphicFramePr>
+            <a:graphic>
+              <a:graphicData uri="http://schemas.openxmlformats.org/drawingml/2006/picture">
+                <pic:pic>
+                  <pic:nvPicPr>
+                    <pic:cNvPr id="0" name="02_graph_overview.png"/>
+                    <pic:cNvPicPr/>
+                  </pic:nvPicPr>
+                  <pic:blipFill>
+                    <a:blip r:embed="rId12"/>
+                    <a:stretch>
+                      <a:fillRect/>
+                    </a:stretch>
+                  </pic:blipFill>
+                  <pic:spPr>
+                    <a:xfrm>
+                      <a:off x="0" y="0"/>
+                      <a:ext cx="5943600" cy="3343275"/>
+                    </a:xfrm>
+                    <a:prstGeom prst="rect"/>
+                  </pic:spPr>
+                </pic:pic>
+              </a:graphicData>
+            </a:graphic>
+          </wp:inline>
+        </w:drawing>
+      </w:r>
+    </w:p>
+    <w:p>
+      <w:r>
+        <w:drawing>
+          <wp:inline xmlns:a="http://schemas.openxmlformats.org/drawingml/2006/main" xmlns:pic="http://schemas.openxmlformats.org/drawingml/2006/picture">
+            <wp:extent cx="5943600" cy="3343275"/>
+            <wp:docPr id="5" name="Picture 5"/>
+            <wp:cNvGraphicFramePr>
+              <a:graphicFrameLocks noChangeAspect="1"/>
+            </wp:cNvGraphicFramePr>
+            <a:graphic>
+              <a:graphicData uri="http://schemas.openxmlformats.org/drawingml/2006/picture">
+                <pic:pic>
+                  <pic:nvPicPr>
+                    <pic:cNvPr id="0" name="03_report_detail.png"/>
+                    <pic:cNvPicPr/>
+                  </pic:nvPicPr>
+                  <pic:blipFill>
+                    <a:blip r:embed="rId13"/>
+                    <a:stretch>
+                      <a:fillRect/>
+                    </a:stretch>
+                  </pic:blipFill>
+                  <pic:spPr>
+                    <a:xfrm>
+                      <a:off x="0" y="0"/>
+                      <a:ext cx="5943600" cy="3343275"/>
+                    </a:xfrm>
+                    <a:prstGeom prst="rect"/>
+                  </pic:spPr>
+                </pic:pic>
+              </a:graphicData>
+            </a:graphic>
+          </wp:inline>
+        </w:drawing>
+      </w:r>
+    </w:p>
+    <w:p>
+      <w:r>
+        <w:drawing>
+          <wp:inline xmlns:a="http://schemas.openxmlformats.org/drawingml/2006/main" xmlns:pic="http://schemas.openxmlformats.org/drawingml/2006/picture">
+            <wp:extent cx="5943600" cy="3343275"/>
+            <wp:docPr id="6" name="Picture 6"/>
+            <wp:cNvGraphicFramePr>
+              <a:graphicFrameLocks noChangeAspect="1"/>
+            </wp:cNvGraphicFramePr>
+            <a:graphic>
+              <a:graphicData uri="http://schemas.openxmlformats.org/drawingml/2006/picture">
+                <pic:pic>
+                  <pic:nvPicPr>
+                    <pic:cNvPr id="0" name="04_manage_compliance.png"/>
+                    <pic:cNvPicPr/>
+                  </pic:nvPicPr>
+                  <pic:blipFill>
+                    <a:blip r:embed="rId14"/>
+                    <a:stretch>
+                      <a:fillRect/>
+                    </a:stretch>
+                  </pic:blipFill>
+                  <pic:spPr>
+                    <a:xfrm>
+                      <a:off x="0" y="0"/>
+                      <a:ext cx="5943600" cy="3343275"/>
+                    </a:xfrm>
+                    <a:prstGeom prst="rect"/>
+                  </pic:spPr>
+                </pic:pic>
+              </a:graphicData>
+            </a:graphic>
+          </wp:inline>
+        </w:drawing>
       </w:r>
     </w:p>
     <w:sectPr>

</xml_diff>